<commit_message>
feat: adicionar estrutura base, pom.xlm e classes de modelo
</commit_message>
<xml_diff>
--- a/docs/requirements.docx
+++ b/docs/requirements.docx
@@ -165,7 +165,15 @@
         <w:jc w:val="both"/>
       </w:pPr>
       <w:r>
-        <w:t>O SGH centraliza a gestão de reservas, alocação de quartos, operações de housekeeping, gestão de manutenção e faturação numa plataforma única, robusta e extensível. A arquitetura foi concebida para suportar múltiplos perfis de utilizadores, garantindo que cada interveniente tem acesso às funcionalidades adequadas ao seu papel.</w:t>
+        <w:t xml:space="preserve">O SGH centraliza a gestão de reservas, alocação de quartos, operações de </w:t>
+      </w:r>
+      <w:proofErr w:type="spellStart"/>
+      <w:r>
+        <w:t>housekeeping</w:t>
+      </w:r>
+      <w:proofErr w:type="spellEnd"/>
+      <w:r>
+        <w:t>, gestão de manutenção e faturação numa plataforma única, robusta e extensível. A arquitetura foi concebida para suportar múltiplos perfis de utilizadores, garantindo que cada interveniente tem acesso às funcionalidades adequadas ao seu papel.</w:t>
       </w:r>
     </w:p>
     <w:p>
@@ -230,7 +238,15 @@
         <w:spacing w:after="120"/>
       </w:pPr>
       <w:r>
-        <w:t>Comunicação deficiente entre receção, housekeeping e manutenção</w:t>
+        <w:t xml:space="preserve">Comunicação deficiente entre receção, </w:t>
+      </w:r>
+      <w:proofErr w:type="spellStart"/>
+      <w:r>
+        <w:t>housekeeping</w:t>
+      </w:r>
+      <w:proofErr w:type="spellEnd"/>
+      <w:r>
+        <w:t xml:space="preserve"> e manutenção</w:t>
       </w:r>
     </w:p>
     <w:p>
@@ -265,7 +281,23 @@
           <w:b/>
           <w:bCs/>
         </w:rPr>
-        <w:t>Visão Geral dos Stakeholders:</w:t>
+        <w:t xml:space="preserve">Visão Geral dos </w:t>
+      </w:r>
+      <w:proofErr w:type="spellStart"/>
+      <w:r>
+        <w:rPr>
+          <w:b/>
+          <w:bCs/>
+        </w:rPr>
+        <w:t>Stakeholders</w:t>
+      </w:r>
+      <w:proofErr w:type="spellEnd"/>
+      <w:r>
+        <w:rPr>
+          <w:b/>
+          <w:bCs/>
+        </w:rPr>
+        <w:t>:</w:t>
       </w:r>
     </w:p>
     <w:p>
@@ -288,16 +320,29 @@
       </w:pPr>
       <w:r>
         <w:lastRenderedPageBreak/>
-        <w:t>2. Análise de Stakeholders</w:t>
-      </w:r>
-    </w:p>
-    <w:p>
-      <w:pPr>
-        <w:spacing w:after="120" w:line="276" w:lineRule="auto"/>
-        <w:jc w:val="both"/>
-      </w:pPr>
-      <w:r>
-        <w:t>A identificação e análise detalhada das partes interessadas é fundamental para garantir que o sistema responde às necessidades reais de cada grupo de utilizadores. Esta secção documenta as características, necessidades, objetivos e preocupações de cada stakeholder.</w:t>
+        <w:t xml:space="preserve">2. Análise de </w:t>
+      </w:r>
+      <w:proofErr w:type="spellStart"/>
+      <w:r>
+        <w:t>Stakeholders</w:t>
+      </w:r>
+      <w:proofErr w:type="spellEnd"/>
+    </w:p>
+    <w:p>
+      <w:pPr>
+        <w:spacing w:after="120" w:line="276" w:lineRule="auto"/>
+        <w:jc w:val="both"/>
+      </w:pPr>
+      <w:r>
+        <w:t xml:space="preserve">A identificação e análise detalhada das partes interessadas é fundamental para garantir que o sistema responde às necessidades reais de cada grupo de utilizadores. Esta secção documenta as características, necessidades, objetivos e preocupações de cada </w:t>
+      </w:r>
+      <w:proofErr w:type="spellStart"/>
+      <w:r>
+        <w:t>stakeholder</w:t>
+      </w:r>
+      <w:proofErr w:type="spellEnd"/>
+      <w:r>
+        <w:t>.</w:t>
       </w:r>
     </w:p>
     <w:p>
@@ -520,7 +565,15 @@
       </w:pPr>
       <w:r>
         <w:lastRenderedPageBreak/>
-        <w:t>2.3. Equipa de Limpeza (Housekeeping)</w:t>
+        <w:t>2.3. Equipa de Limpeza (</w:t>
+      </w:r>
+      <w:proofErr w:type="spellStart"/>
+      <w:r>
+        <w:t>Housekeeping</w:t>
+      </w:r>
+      <w:proofErr w:type="spellEnd"/>
+      <w:r>
+        <w:t>)</w:t>
       </w:r>
     </w:p>
     <w:p>
@@ -770,7 +823,15 @@
         <w:spacing w:after="80"/>
       </w:pPr>
       <w:r>
-        <w:t>Relatórios de ocupação em tempo real (taxa de ocupação, RevPAR, ADR)</w:t>
+        <w:t xml:space="preserve">Relatórios de ocupação em tempo real (taxa de ocupação, </w:t>
+      </w:r>
+      <w:proofErr w:type="spellStart"/>
+      <w:r>
+        <w:t>RevPAR</w:t>
+      </w:r>
+      <w:proofErr w:type="spellEnd"/>
+      <w:r>
+        <w:t>, ADR)</w:t>
       </w:r>
     </w:p>
     <w:p>
@@ -796,7 +857,23 @@
         <w:spacing w:after="80"/>
       </w:pPr>
       <w:r>
-        <w:t>Painéis de controlo (dashboards) com KPIs operacionais</w:t>
+        <w:t>Painéis de controlo (</w:t>
+      </w:r>
+      <w:proofErr w:type="spellStart"/>
+      <w:r>
+        <w:t>dashboards</w:t>
+      </w:r>
+      <w:proofErr w:type="spellEnd"/>
+      <w:r>
+        <w:t xml:space="preserve">) com </w:t>
+      </w:r>
+      <w:proofErr w:type="spellStart"/>
+      <w:r>
+        <w:t>KPIs</w:t>
+      </w:r>
+      <w:proofErr w:type="spellEnd"/>
+      <w:r>
+        <w:t xml:space="preserve"> operacionais</w:t>
       </w:r>
     </w:p>
     <w:p>
@@ -883,8 +960,13 @@
         <w:spacing w:after="80"/>
       </w:pPr>
       <w:r>
-        <w:t>Registos detalhados de auditoria para diagnóstico e compliance</w:t>
-      </w:r>
+        <w:t xml:space="preserve">Registos detalhados de auditoria para diagnóstico e </w:t>
+      </w:r>
+      <w:proofErr w:type="spellStart"/>
+      <w:r>
+        <w:t>compliance</w:t>
+      </w:r>
+      <w:proofErr w:type="spellEnd"/>
     </w:p>
     <w:p>
       <w:pPr>
@@ -908,8 +990,13 @@
         </w:numPr>
         <w:spacing w:after="120"/>
       </w:pPr>
-      <w:r>
-        <w:t>APIs documentadas para integração com sistemas externos</w:t>
+      <w:proofErr w:type="spellStart"/>
+      <w:r>
+        <w:t>APIs</w:t>
+      </w:r>
+      <w:proofErr w:type="spellEnd"/>
+      <w:r>
+        <w:t xml:space="preserve"> documentadas para integração com sistemas externos</w:t>
       </w:r>
     </w:p>
     <w:p>
@@ -927,7 +1014,39 @@
         <w:jc w:val="both"/>
       </w:pPr>
       <w:r>
-        <w:t>Preocupações: Vulnerabilidades de segurança, complexidade de integração com channel managers e gateways de pagamento, disaster recovery.</w:t>
+        <w:t xml:space="preserve">Preocupações: Vulnerabilidades de segurança, complexidade de integração com </w:t>
+      </w:r>
+      <w:proofErr w:type="spellStart"/>
+      <w:r>
+        <w:t>channel</w:t>
+      </w:r>
+      <w:proofErr w:type="spellEnd"/>
+      <w:r>
+        <w:t xml:space="preserve"> managers e </w:t>
+      </w:r>
+      <w:proofErr w:type="spellStart"/>
+      <w:r>
+        <w:t>gateways</w:t>
+      </w:r>
+      <w:proofErr w:type="spellEnd"/>
+      <w:r>
+        <w:t xml:space="preserve"> de pagamento, </w:t>
+      </w:r>
+      <w:proofErr w:type="spellStart"/>
+      <w:r>
+        <w:t>disaster</w:t>
+      </w:r>
+      <w:proofErr w:type="spellEnd"/>
+      <w:r>
+        <w:t xml:space="preserve"> </w:t>
+      </w:r>
+      <w:proofErr w:type="spellStart"/>
+      <w:r>
+        <w:t>recovery</w:t>
+      </w:r>
+      <w:proofErr w:type="spellEnd"/>
+      <w:r>
+        <w:t>.</w:t>
       </w:r>
     </w:p>
     <w:p>
@@ -950,7 +1069,79 @@
         <w:jc w:val="both"/>
       </w:pPr>
       <w:r>
-        <w:t>Os requisitos funcionais descrevem as funcionalidades específicas que o sistema deve oferecer. Estão organizados por módulo e priorizados segundo o método MoSCoW (Must have, Should have, Could have, Won't have). Cada requisito inclui descrição, critérios de aceitação e stakeholders associados.</w:t>
+        <w:t xml:space="preserve">Os requisitos funcionais descrevem as funcionalidades específicas que o sistema deve oferecer. Estão organizados por módulo e priorizados segundo o método </w:t>
+      </w:r>
+      <w:proofErr w:type="spellStart"/>
+      <w:r>
+        <w:t>MoSCoW</w:t>
+      </w:r>
+      <w:proofErr w:type="spellEnd"/>
+      <w:r>
+        <w:t xml:space="preserve"> (Must </w:t>
+      </w:r>
+      <w:proofErr w:type="spellStart"/>
+      <w:r>
+        <w:t>have</w:t>
+      </w:r>
+      <w:proofErr w:type="spellEnd"/>
+      <w:r>
+        <w:t xml:space="preserve">, </w:t>
+      </w:r>
+      <w:proofErr w:type="spellStart"/>
+      <w:r>
+        <w:t>Should</w:t>
+      </w:r>
+      <w:proofErr w:type="spellEnd"/>
+      <w:r>
+        <w:t xml:space="preserve"> </w:t>
+      </w:r>
+      <w:proofErr w:type="spellStart"/>
+      <w:r>
+        <w:t>have</w:t>
+      </w:r>
+      <w:proofErr w:type="spellEnd"/>
+      <w:r>
+        <w:t xml:space="preserve">, </w:t>
+      </w:r>
+      <w:proofErr w:type="spellStart"/>
+      <w:r>
+        <w:t>Could</w:t>
+      </w:r>
+      <w:proofErr w:type="spellEnd"/>
+      <w:r>
+        <w:t xml:space="preserve"> </w:t>
+      </w:r>
+      <w:proofErr w:type="spellStart"/>
+      <w:r>
+        <w:t>have</w:t>
+      </w:r>
+      <w:proofErr w:type="spellEnd"/>
+      <w:r>
+        <w:t xml:space="preserve">, </w:t>
+      </w:r>
+      <w:proofErr w:type="spellStart"/>
+      <w:r>
+        <w:t>Won't</w:t>
+      </w:r>
+      <w:proofErr w:type="spellEnd"/>
+      <w:r>
+        <w:t xml:space="preserve"> </w:t>
+      </w:r>
+      <w:proofErr w:type="spellStart"/>
+      <w:r>
+        <w:t>have</w:t>
+      </w:r>
+      <w:proofErr w:type="spellEnd"/>
+      <w:r>
+        <w:t xml:space="preserve">). Cada requisito inclui descrição, critérios de aceitação e </w:t>
+      </w:r>
+      <w:proofErr w:type="spellStart"/>
+      <w:r>
+        <w:t>stakeholders</w:t>
+      </w:r>
+      <w:proofErr w:type="spellEnd"/>
+      <w:r>
+        <w:t xml:space="preserve"> associados.</w:t>
       </w:r>
     </w:p>
     <w:p>
@@ -989,7 +1180,15 @@
         <w:jc w:val="both"/>
       </w:pPr>
       <w:r>
-        <w:t>Prioridade: Must Have (Crítica)</w:t>
+        <w:t xml:space="preserve">Prioridade: Must </w:t>
+      </w:r>
+      <w:proofErr w:type="spellStart"/>
+      <w:r>
+        <w:t>Have</w:t>
+      </w:r>
+      <w:proofErr w:type="spellEnd"/>
+      <w:r>
+        <w:t xml:space="preserve"> (Crítica)</w:t>
       </w:r>
     </w:p>
     <w:p>
@@ -1006,8 +1205,13 @@
         <w:spacing w:after="120" w:line="276" w:lineRule="auto"/>
         <w:jc w:val="both"/>
       </w:pPr>
-      <w:r>
-        <w:t>Stakeholders: Rececionistas, Hóspedes</w:t>
+      <w:proofErr w:type="spellStart"/>
+      <w:r>
+        <w:t>Stakeholders</w:t>
+      </w:r>
+      <w:proofErr w:type="spellEnd"/>
+      <w:r>
+        <w:t>: Rececionistas, Hóspedes</w:t>
       </w:r>
     </w:p>
     <w:p>
@@ -1038,7 +1242,15 @@
         <w:jc w:val="both"/>
       </w:pPr>
       <w:r>
-        <w:t>Prioridade: Must Have (Crítica)</w:t>
+        <w:t xml:space="preserve">Prioridade: Must </w:t>
+      </w:r>
+      <w:proofErr w:type="spellStart"/>
+      <w:r>
+        <w:t>Have</w:t>
+      </w:r>
+      <w:proofErr w:type="spellEnd"/>
+      <w:r>
+        <w:t xml:space="preserve"> (Crítica)</w:t>
       </w:r>
     </w:p>
     <w:p>
@@ -1055,8 +1267,13 @@
         <w:spacing w:after="120" w:line="276" w:lineRule="auto"/>
         <w:jc w:val="both"/>
       </w:pPr>
-      <w:r>
-        <w:t>Stakeholders: Rececionistas, Hóspedes</w:t>
+      <w:proofErr w:type="spellStart"/>
+      <w:r>
+        <w:t>Stakeholders</w:t>
+      </w:r>
+      <w:proofErr w:type="spellEnd"/>
+      <w:r>
+        <w:t>: Rececionistas, Hóspedes</w:t>
       </w:r>
     </w:p>
     <w:p>
@@ -1087,8 +1304,13 @@
         <w:jc w:val="both"/>
       </w:pPr>
       <w:r>
-        <w:t>Prioridade: Must Have</w:t>
-      </w:r>
+        <w:t xml:space="preserve">Prioridade: Must </w:t>
+      </w:r>
+      <w:proofErr w:type="spellStart"/>
+      <w:r>
+        <w:t>Have</w:t>
+      </w:r>
+      <w:proofErr w:type="spellEnd"/>
     </w:p>
     <w:p>
       <w:pPr>
@@ -1104,8 +1326,13 @@
         <w:spacing w:after="120" w:line="276" w:lineRule="auto"/>
         <w:jc w:val="both"/>
       </w:pPr>
-      <w:r>
-        <w:t>Stakeholders: Rececionistas, Hóspedes</w:t>
+      <w:proofErr w:type="spellStart"/>
+      <w:r>
+        <w:t>Stakeholders</w:t>
+      </w:r>
+      <w:proofErr w:type="spellEnd"/>
+      <w:r>
+        <w:t>: Rececionistas, Hóspedes</w:t>
       </w:r>
     </w:p>
     <w:p>
@@ -1152,8 +1379,21 @@
         <w:jc w:val="both"/>
       </w:pPr>
       <w:r>
-        <w:t>Prioridade: Should Have</w:t>
-      </w:r>
+        <w:t xml:space="preserve">Prioridade: </w:t>
+      </w:r>
+      <w:proofErr w:type="spellStart"/>
+      <w:r>
+        <w:t>Should</w:t>
+      </w:r>
+      <w:proofErr w:type="spellEnd"/>
+      <w:r>
+        <w:t xml:space="preserve"> </w:t>
+      </w:r>
+      <w:proofErr w:type="spellStart"/>
+      <w:r>
+        <w:t>Have</w:t>
+      </w:r>
+      <w:proofErr w:type="spellEnd"/>
     </w:p>
     <w:p>
       <w:pPr>
@@ -1169,8 +1409,13 @@
         <w:spacing w:after="120" w:line="276" w:lineRule="auto"/>
         <w:jc w:val="both"/>
       </w:pPr>
-      <w:r>
-        <w:t>Stakeholders: Rececionistas</w:t>
+      <w:proofErr w:type="spellStart"/>
+      <w:r>
+        <w:t>Stakeholders</w:t>
+      </w:r>
+      <w:proofErr w:type="spellEnd"/>
+      <w:r>
+        <w:t>: Rececionistas</w:t>
       </w:r>
     </w:p>
     <w:p>
@@ -1201,8 +1446,21 @@
         <w:jc w:val="both"/>
       </w:pPr>
       <w:r>
-        <w:t>Prioridade: Could Have</w:t>
-      </w:r>
+        <w:t xml:space="preserve">Prioridade: </w:t>
+      </w:r>
+      <w:proofErr w:type="spellStart"/>
+      <w:r>
+        <w:t>Could</w:t>
+      </w:r>
+      <w:proofErr w:type="spellEnd"/>
+      <w:r>
+        <w:t xml:space="preserve"> </w:t>
+      </w:r>
+      <w:proofErr w:type="spellStart"/>
+      <w:r>
+        <w:t>Have</w:t>
+      </w:r>
+      <w:proofErr w:type="spellEnd"/>
     </w:p>
     <w:p>
       <w:pPr>
@@ -1218,8 +1476,13 @@
         <w:spacing w:after="120" w:line="276" w:lineRule="auto"/>
         <w:jc w:val="both"/>
       </w:pPr>
-      <w:r>
-        <w:t>Stakeholders: Rececionistas, Gestores</w:t>
+      <w:proofErr w:type="spellStart"/>
+      <w:r>
+        <w:t>Stakeholders</w:t>
+      </w:r>
+      <w:proofErr w:type="spellEnd"/>
+      <w:r>
+        <w:t>: Rececionistas, Gestores</w:t>
       </w:r>
     </w:p>
     <w:p>
@@ -1258,7 +1521,15 @@
         <w:jc w:val="both"/>
       </w:pPr>
       <w:r>
-        <w:t>Prioridade: Must Have (Crítica)</w:t>
+        <w:t xml:space="preserve">Prioridade: Must </w:t>
+      </w:r>
+      <w:proofErr w:type="spellStart"/>
+      <w:r>
+        <w:t>Have</w:t>
+      </w:r>
+      <w:proofErr w:type="spellEnd"/>
+      <w:r>
+        <w:t xml:space="preserve"> (Crítica)</w:t>
       </w:r>
     </w:p>
     <w:p>
@@ -1275,8 +1546,13 @@
         <w:spacing w:after="120" w:line="276" w:lineRule="auto"/>
         <w:jc w:val="both"/>
       </w:pPr>
-      <w:r>
-        <w:t>Stakeholders: Rececionistas, Hóspedes</w:t>
+      <w:proofErr w:type="spellStart"/>
+      <w:r>
+        <w:t>Stakeholders</w:t>
+      </w:r>
+      <w:proofErr w:type="spellEnd"/>
+      <w:r>
+        <w:t>: Rececionistas, Hóspedes</w:t>
       </w:r>
     </w:p>
     <w:p>
@@ -1307,7 +1583,15 @@
         <w:jc w:val="both"/>
       </w:pPr>
       <w:r>
-        <w:t>Prioridade: Must Have (Crítica)</w:t>
+        <w:t xml:space="preserve">Prioridade: Must </w:t>
+      </w:r>
+      <w:proofErr w:type="spellStart"/>
+      <w:r>
+        <w:t>Have</w:t>
+      </w:r>
+      <w:proofErr w:type="spellEnd"/>
+      <w:r>
+        <w:t xml:space="preserve"> (Crítica)</w:t>
       </w:r>
     </w:p>
     <w:p>
@@ -1324,8 +1608,13 @@
         <w:spacing w:after="120" w:line="276" w:lineRule="auto"/>
         <w:jc w:val="both"/>
       </w:pPr>
-      <w:r>
-        <w:t>Stakeholders: Rececionistas, Hóspedes, Gestores</w:t>
+      <w:proofErr w:type="spellStart"/>
+      <w:r>
+        <w:t>Stakeholders</w:t>
+      </w:r>
+      <w:proofErr w:type="spellEnd"/>
+      <w:r>
+        <w:t>: Rececionistas, Hóspedes, Gestores</w:t>
       </w:r>
     </w:p>
     <w:p>
@@ -1366,8 +1655,21 @@
         <w:jc w:val="both"/>
       </w:pPr>
       <w:r>
-        <w:t>Prioridade: Should Have</w:t>
-      </w:r>
+        <w:t xml:space="preserve">Prioridade: </w:t>
+      </w:r>
+      <w:proofErr w:type="spellStart"/>
+      <w:r>
+        <w:t>Should</w:t>
+      </w:r>
+      <w:proofErr w:type="spellEnd"/>
+      <w:r>
+        <w:t xml:space="preserve"> </w:t>
+      </w:r>
+      <w:proofErr w:type="spellStart"/>
+      <w:r>
+        <w:t>Have</w:t>
+      </w:r>
+      <w:proofErr w:type="spellEnd"/>
     </w:p>
     <w:p>
       <w:pPr>
@@ -1383,8 +1685,13 @@
         <w:spacing w:after="120" w:line="276" w:lineRule="auto"/>
         <w:jc w:val="both"/>
       </w:pPr>
-      <w:r>
-        <w:t>Stakeholders: Rececionistas</w:t>
+      <w:proofErr w:type="spellStart"/>
+      <w:r>
+        <w:t>Stakeholders</w:t>
+      </w:r>
+      <w:proofErr w:type="spellEnd"/>
+      <w:r>
+        <w:t>: Rececionistas</w:t>
       </w:r>
     </w:p>
     <w:p>
@@ -1392,7 +1699,15 @@
         <w:pStyle w:val="Ttulo2"/>
       </w:pPr>
       <w:r>
-        <w:t>3.3. Módulo de Governança (Housekeeping)</w:t>
+        <w:t>3.3. Módulo de Governança (</w:t>
+      </w:r>
+      <w:proofErr w:type="spellStart"/>
+      <w:r>
+        <w:t>Housekeeping</w:t>
+      </w:r>
+      <w:proofErr w:type="spellEnd"/>
+      <w:r>
+        <w:t>)</w:t>
       </w:r>
     </w:p>
     <w:p>
@@ -1423,25 +1738,51 @@
         <w:jc w:val="both"/>
       </w:pPr>
       <w:r>
-        <w:t>Prioridade: Should Have</w:t>
-      </w:r>
-    </w:p>
-    <w:p>
-      <w:pPr>
-        <w:spacing w:after="120" w:line="276" w:lineRule="auto"/>
-        <w:jc w:val="both"/>
-      </w:pPr>
-      <w:r>
-        <w:t>Critérios de Aceitação: Governanta marca quarto como 'Limpo'; estado atualiza para 'Pronto' (disponível para check-in); receção é notificada automaticamente; timestamp de conclusão registado.</w:t>
-      </w:r>
-    </w:p>
-    <w:p>
-      <w:pPr>
-        <w:spacing w:after="120" w:line="276" w:lineRule="auto"/>
-        <w:jc w:val="both"/>
-      </w:pPr>
-      <w:r>
-        <w:t>Stakeholders: Equipa de Limpeza, Rececionistas</w:t>
+        <w:t xml:space="preserve">Prioridade: </w:t>
+      </w:r>
+      <w:proofErr w:type="spellStart"/>
+      <w:r>
+        <w:t>Should</w:t>
+      </w:r>
+      <w:proofErr w:type="spellEnd"/>
+      <w:r>
+        <w:t xml:space="preserve"> </w:t>
+      </w:r>
+      <w:proofErr w:type="spellStart"/>
+      <w:r>
+        <w:t>Have</w:t>
+      </w:r>
+      <w:proofErr w:type="spellEnd"/>
+    </w:p>
+    <w:p>
+      <w:pPr>
+        <w:spacing w:after="120" w:line="276" w:lineRule="auto"/>
+        <w:jc w:val="both"/>
+      </w:pPr>
+      <w:r>
+        <w:t xml:space="preserve">Critérios de Aceitação: Governanta marca quarto como 'Limpo'; estado atualiza para 'Pronto' (disponível para check-in); receção é notificada automaticamente; </w:t>
+      </w:r>
+      <w:proofErr w:type="spellStart"/>
+      <w:r>
+        <w:t>timestamp</w:t>
+      </w:r>
+      <w:proofErr w:type="spellEnd"/>
+      <w:r>
+        <w:t xml:space="preserve"> de conclusão registado.</w:t>
+      </w:r>
+    </w:p>
+    <w:p>
+      <w:pPr>
+        <w:spacing w:after="120" w:line="276" w:lineRule="auto"/>
+        <w:jc w:val="both"/>
+      </w:pPr>
+      <w:proofErr w:type="spellStart"/>
+      <w:r>
+        <w:t>Stakeholders</w:t>
+      </w:r>
+      <w:proofErr w:type="spellEnd"/>
+      <w:r>
+        <w:t>: Equipa de Limpeza, Rececionistas</w:t>
       </w:r>
     </w:p>
     <w:p>
@@ -1472,8 +1813,21 @@
         <w:jc w:val="both"/>
       </w:pPr>
       <w:r>
-        <w:t>Prioridade: Could Have</w:t>
-      </w:r>
+        <w:t xml:space="preserve">Prioridade: </w:t>
+      </w:r>
+      <w:proofErr w:type="spellStart"/>
+      <w:r>
+        <w:t>Could</w:t>
+      </w:r>
+      <w:proofErr w:type="spellEnd"/>
+      <w:r>
+        <w:t xml:space="preserve"> </w:t>
+      </w:r>
+      <w:proofErr w:type="spellStart"/>
+      <w:r>
+        <w:t>Have</w:t>
+      </w:r>
+      <w:proofErr w:type="spellEnd"/>
     </w:p>
     <w:p>
       <w:pPr>
@@ -1489,8 +1843,13 @@
         <w:spacing w:after="120" w:line="276" w:lineRule="auto"/>
         <w:jc w:val="both"/>
       </w:pPr>
-      <w:r>
-        <w:t>Stakeholders: Equipa de Limpeza</w:t>
+      <w:proofErr w:type="spellStart"/>
+      <w:r>
+        <w:t>Stakeholders</w:t>
+      </w:r>
+      <w:proofErr w:type="spellEnd"/>
+      <w:r>
+        <w:t>: Equipa de Limpeza</w:t>
       </w:r>
     </w:p>
     <w:p>
@@ -1529,8 +1888,21 @@
         <w:jc w:val="both"/>
       </w:pPr>
       <w:r>
-        <w:t>Prioridade: Should Have</w:t>
-      </w:r>
+        <w:t xml:space="preserve">Prioridade: </w:t>
+      </w:r>
+      <w:proofErr w:type="spellStart"/>
+      <w:r>
+        <w:t>Should</w:t>
+      </w:r>
+      <w:proofErr w:type="spellEnd"/>
+      <w:r>
+        <w:t xml:space="preserve"> </w:t>
+      </w:r>
+      <w:proofErr w:type="spellStart"/>
+      <w:r>
+        <w:t>Have</w:t>
+      </w:r>
+      <w:proofErr w:type="spellEnd"/>
     </w:p>
     <w:p>
       <w:pPr>
@@ -1546,8 +1918,13 @@
         <w:spacing w:after="120" w:line="276" w:lineRule="auto"/>
         <w:jc w:val="both"/>
       </w:pPr>
-      <w:r>
-        <w:t>Stakeholders: Equipa de Manutenção, Rececionistas, Equipa de Limpeza</w:t>
+      <w:proofErr w:type="spellStart"/>
+      <w:r>
+        <w:t>Stakeholders</w:t>
+      </w:r>
+      <w:proofErr w:type="spellEnd"/>
+      <w:r>
+        <w:t>: Equipa de Manutenção, Rececionistas, Equipa de Limpeza</w:t>
       </w:r>
     </w:p>
     <w:p>
@@ -1588,8 +1965,21 @@
         <w:jc w:val="both"/>
       </w:pPr>
       <w:r>
-        <w:t>Prioridade: Should Have</w:t>
-      </w:r>
+        <w:t xml:space="preserve">Prioridade: </w:t>
+      </w:r>
+      <w:proofErr w:type="spellStart"/>
+      <w:r>
+        <w:t>Should</w:t>
+      </w:r>
+      <w:proofErr w:type="spellEnd"/>
+      <w:r>
+        <w:t xml:space="preserve"> </w:t>
+      </w:r>
+      <w:proofErr w:type="spellStart"/>
+      <w:r>
+        <w:t>Have</w:t>
+      </w:r>
+      <w:proofErr w:type="spellEnd"/>
     </w:p>
     <w:p>
       <w:pPr>
@@ -1605,8 +1995,13 @@
         <w:spacing w:after="120" w:line="276" w:lineRule="auto"/>
         <w:jc w:val="both"/>
       </w:pPr>
-      <w:r>
-        <w:t>Stakeholders: Equipa de Manutenção</w:t>
+      <w:proofErr w:type="spellStart"/>
+      <w:r>
+        <w:t>Stakeholders</w:t>
+      </w:r>
+      <w:proofErr w:type="spellEnd"/>
+      <w:r>
+        <w:t>: Equipa de Manutenção</w:t>
       </w:r>
     </w:p>
     <w:p>
@@ -1645,8 +2040,13 @@
         <w:jc w:val="both"/>
       </w:pPr>
       <w:r>
-        <w:t>Prioridade: Must Have</w:t>
-      </w:r>
+        <w:t xml:space="preserve">Prioridade: Must </w:t>
+      </w:r>
+      <w:proofErr w:type="spellStart"/>
+      <w:r>
+        <w:t>Have</w:t>
+      </w:r>
+      <w:proofErr w:type="spellEnd"/>
     </w:p>
     <w:p>
       <w:pPr>
@@ -1662,8 +2062,13 @@
         <w:spacing w:after="120" w:line="276" w:lineRule="auto"/>
         <w:jc w:val="both"/>
       </w:pPr>
-      <w:r>
-        <w:t>Stakeholders: Gestores, Equipa de TI</w:t>
+      <w:proofErr w:type="spellStart"/>
+      <w:r>
+        <w:t>Stakeholders</w:t>
+      </w:r>
+      <w:proofErr w:type="spellEnd"/>
+      <w:r>
+        <w:t>: Gestores, Equipa de TI</w:t>
       </w:r>
     </w:p>
     <w:p>
@@ -1694,8 +2099,21 @@
         <w:jc w:val="both"/>
       </w:pPr>
       <w:r>
-        <w:t>Prioridade: Should Have</w:t>
-      </w:r>
+        <w:t xml:space="preserve">Prioridade: </w:t>
+      </w:r>
+      <w:proofErr w:type="spellStart"/>
+      <w:r>
+        <w:t>Should</w:t>
+      </w:r>
+      <w:proofErr w:type="spellEnd"/>
+      <w:r>
+        <w:t xml:space="preserve"> </w:t>
+      </w:r>
+      <w:proofErr w:type="spellStart"/>
+      <w:r>
+        <w:t>Have</w:t>
+      </w:r>
+      <w:proofErr w:type="spellEnd"/>
     </w:p>
     <w:p>
       <w:pPr>
@@ -1711,8 +2129,13 @@
         <w:spacing w:after="120" w:line="276" w:lineRule="auto"/>
         <w:jc w:val="both"/>
       </w:pPr>
-      <w:r>
-        <w:t>Stakeholders: Gestores</w:t>
+      <w:proofErr w:type="spellStart"/>
+      <w:r>
+        <w:t>Stakeholders</w:t>
+      </w:r>
+      <w:proofErr w:type="spellEnd"/>
+      <w:r>
+        <w:t>: Gestores</w:t>
       </w:r>
     </w:p>
     <w:p>
@@ -1734,17 +2157,78 @@
         <w:jc w:val="both"/>
       </w:pPr>
       <w:r>
-        <w:t>Descrição: Gera relatórios com percentagem de ocupação, RevPAR (Revenue per Available Room) e ADR (Average Daily Rate).</w:t>
-      </w:r>
-    </w:p>
-    <w:p>
-      <w:pPr>
-        <w:spacing w:after="120" w:line="276" w:lineRule="auto"/>
-        <w:jc w:val="both"/>
-      </w:pPr>
-      <w:r>
-        <w:t>Prioridade: Should Have</w:t>
-      </w:r>
+        <w:t xml:space="preserve">Descrição: Gera relatórios com percentagem de ocupação, </w:t>
+      </w:r>
+      <w:proofErr w:type="spellStart"/>
+      <w:r>
+        <w:t>RevPAR</w:t>
+      </w:r>
+      <w:proofErr w:type="spellEnd"/>
+      <w:r>
+        <w:t xml:space="preserve"> (</w:t>
+      </w:r>
+      <w:proofErr w:type="spellStart"/>
+      <w:r>
+        <w:t>Revenue</w:t>
+      </w:r>
+      <w:proofErr w:type="spellEnd"/>
+      <w:r>
+        <w:t xml:space="preserve"> per </w:t>
+      </w:r>
+      <w:proofErr w:type="spellStart"/>
+      <w:r>
+        <w:t>Available</w:t>
+      </w:r>
+      <w:proofErr w:type="spellEnd"/>
+      <w:r>
+        <w:t xml:space="preserve"> </w:t>
+      </w:r>
+      <w:proofErr w:type="spellStart"/>
+      <w:r>
+        <w:t>Room</w:t>
+      </w:r>
+      <w:proofErr w:type="spellEnd"/>
+      <w:r>
+        <w:t>) e ADR (</w:t>
+      </w:r>
+      <w:proofErr w:type="spellStart"/>
+      <w:r>
+        <w:t>Average</w:t>
+      </w:r>
+      <w:proofErr w:type="spellEnd"/>
+      <w:r>
+        <w:t xml:space="preserve"> </w:t>
+      </w:r>
+      <w:proofErr w:type="spellStart"/>
+      <w:r>
+        <w:t>Daily</w:t>
+      </w:r>
+      <w:proofErr w:type="spellEnd"/>
+      <w:r>
+        <w:t xml:space="preserve"> Rate).</w:t>
+      </w:r>
+    </w:p>
+    <w:p>
+      <w:pPr>
+        <w:spacing w:after="120" w:line="276" w:lineRule="auto"/>
+        <w:jc w:val="both"/>
+      </w:pPr>
+      <w:r>
+        <w:t xml:space="preserve">Prioridade: </w:t>
+      </w:r>
+      <w:proofErr w:type="spellStart"/>
+      <w:r>
+        <w:t>Should</w:t>
+      </w:r>
+      <w:proofErr w:type="spellEnd"/>
+      <w:r>
+        <w:t xml:space="preserve"> </w:t>
+      </w:r>
+      <w:proofErr w:type="spellStart"/>
+      <w:r>
+        <w:t>Have</w:t>
+      </w:r>
+      <w:proofErr w:type="spellEnd"/>
     </w:p>
     <w:p>
       <w:pPr>
@@ -1760,8 +2244,13 @@
         <w:spacing w:after="120" w:line="276" w:lineRule="auto"/>
         <w:jc w:val="both"/>
       </w:pPr>
-      <w:r>
-        <w:t>Stakeholders: Gestores</w:t>
+      <w:proofErr w:type="spellStart"/>
+      <w:r>
+        <w:t>Stakeholders</w:t>
+      </w:r>
+      <w:proofErr w:type="spellEnd"/>
+      <w:r>
+        <w:t>: Gestores</w:t>
       </w:r>
     </w:p>
     <w:p>
@@ -1808,25 +2297,51 @@
         <w:jc w:val="both"/>
       </w:pPr>
       <w:r>
-        <w:t>Prioridade: Should Have</w:t>
-      </w:r>
-    </w:p>
-    <w:p>
-      <w:pPr>
-        <w:spacing w:after="120" w:line="276" w:lineRule="auto"/>
-        <w:jc w:val="both"/>
-      </w:pPr>
-      <w:r>
-        <w:t>Critérios de Aceitação: Dados agregados por dia/semana/mês; breakdown por fonte de receita (quartos, F&amp;B, outros); exportação PDF/Excel.</w:t>
-      </w:r>
-    </w:p>
-    <w:p>
-      <w:pPr>
-        <w:spacing w:after="120" w:line="276" w:lineRule="auto"/>
-        <w:jc w:val="both"/>
-      </w:pPr>
-      <w:r>
-        <w:t>Stakeholders: Gestores</w:t>
+        <w:t xml:space="preserve">Prioridade: </w:t>
+      </w:r>
+      <w:proofErr w:type="spellStart"/>
+      <w:r>
+        <w:t>Should</w:t>
+      </w:r>
+      <w:proofErr w:type="spellEnd"/>
+      <w:r>
+        <w:t xml:space="preserve"> </w:t>
+      </w:r>
+      <w:proofErr w:type="spellStart"/>
+      <w:r>
+        <w:t>Have</w:t>
+      </w:r>
+      <w:proofErr w:type="spellEnd"/>
+    </w:p>
+    <w:p>
+      <w:pPr>
+        <w:spacing w:after="120" w:line="276" w:lineRule="auto"/>
+        <w:jc w:val="both"/>
+      </w:pPr>
+      <w:r>
+        <w:t xml:space="preserve">Critérios de Aceitação: Dados agregados por dia/semana/mês; </w:t>
+      </w:r>
+      <w:proofErr w:type="spellStart"/>
+      <w:r>
+        <w:t>breakdown</w:t>
+      </w:r>
+      <w:proofErr w:type="spellEnd"/>
+      <w:r>
+        <w:t xml:space="preserve"> por fonte de receita (quartos, F&amp;B, outros); exportação PDF/Excel.</w:t>
+      </w:r>
+    </w:p>
+    <w:p>
+      <w:pPr>
+        <w:spacing w:after="120" w:line="276" w:lineRule="auto"/>
+        <w:jc w:val="both"/>
+      </w:pPr>
+      <w:proofErr w:type="spellStart"/>
+      <w:r>
+        <w:t>Stakeholders</w:t>
+      </w:r>
+      <w:proofErr w:type="spellEnd"/>
+      <w:r>
+        <w:t>: Gestores</w:t>
       </w:r>
     </w:p>
     <w:p>
@@ -1865,25 +2380,46 @@
         <w:jc w:val="both"/>
       </w:pPr>
       <w:r>
-        <w:t>Prioridade: Must Have (Crítica)</w:t>
-      </w:r>
-    </w:p>
-    <w:p>
-      <w:pPr>
-        <w:spacing w:after="120" w:line="276" w:lineRule="auto"/>
-        <w:jc w:val="both"/>
-      </w:pPr>
-      <w:r>
-        <w:t>Critérios de Aceitação: Login com username e password; cada perfil acede apenas às funcionalidades autorizadas; sessão expira após 30 minutos de inatividade.</w:t>
-      </w:r>
-    </w:p>
-    <w:p>
-      <w:pPr>
-        <w:spacing w:after="120" w:line="276" w:lineRule="auto"/>
-        <w:jc w:val="both"/>
-      </w:pPr>
-      <w:r>
-        <w:t>Stakeholders: Todos os utilizadores, Equipa de TI</w:t>
+        <w:t xml:space="preserve">Prioridade: Must </w:t>
+      </w:r>
+      <w:proofErr w:type="spellStart"/>
+      <w:r>
+        <w:t>Have</w:t>
+      </w:r>
+      <w:proofErr w:type="spellEnd"/>
+      <w:r>
+        <w:t xml:space="preserve"> (Crítica)</w:t>
+      </w:r>
+    </w:p>
+    <w:p>
+      <w:pPr>
+        <w:spacing w:after="120" w:line="276" w:lineRule="auto"/>
+        <w:jc w:val="both"/>
+      </w:pPr>
+      <w:r>
+        <w:t xml:space="preserve">Critérios de Aceitação: Login com </w:t>
+      </w:r>
+      <w:proofErr w:type="spellStart"/>
+      <w:r>
+        <w:t>username</w:t>
+      </w:r>
+      <w:proofErr w:type="spellEnd"/>
+      <w:r>
+        <w:t xml:space="preserve"> e password; cada perfil acede apenas às funcionalidades autorizadas; sessão expira após 30 minutos de inatividade.</w:t>
+      </w:r>
+    </w:p>
+    <w:p>
+      <w:pPr>
+        <w:spacing w:after="120" w:line="276" w:lineRule="auto"/>
+        <w:jc w:val="both"/>
+      </w:pPr>
+      <w:proofErr w:type="spellStart"/>
+      <w:r>
+        <w:t>Stakeholders</w:t>
+      </w:r>
+      <w:proofErr w:type="spellEnd"/>
+      <w:r>
+        <w:t>: Todos os utilizadores, Equipa de TI</w:t>
       </w:r>
     </w:p>
     <w:p>
@@ -1914,8 +2450,21 @@
         <w:jc w:val="both"/>
       </w:pPr>
       <w:r>
-        <w:t>Prioridade: Could Have</w:t>
-      </w:r>
+        <w:t xml:space="preserve">Prioridade: </w:t>
+      </w:r>
+      <w:proofErr w:type="spellStart"/>
+      <w:r>
+        <w:t>Could</w:t>
+      </w:r>
+      <w:proofErr w:type="spellEnd"/>
+      <w:r>
+        <w:t xml:space="preserve"> </w:t>
+      </w:r>
+      <w:proofErr w:type="spellStart"/>
+      <w:r>
+        <w:t>Have</w:t>
+      </w:r>
+      <w:proofErr w:type="spellEnd"/>
     </w:p>
     <w:p>
       <w:pPr>
@@ -1931,8 +2480,13 @@
         <w:spacing w:after="120" w:line="276" w:lineRule="auto"/>
         <w:jc w:val="both"/>
       </w:pPr>
-      <w:r>
-        <w:t>Stakeholders: Hóspedes, Rececionistas</w:t>
+      <w:proofErr w:type="spellStart"/>
+      <w:r>
+        <w:t>Stakeholders</w:t>
+      </w:r>
+      <w:proofErr w:type="spellEnd"/>
+      <w:r>
+        <w:t>: Hóspedes, Rececionistas</w:t>
       </w:r>
     </w:p>
     <w:p>
@@ -2007,7 +2561,23 @@
         <w:jc w:val="both"/>
       </w:pPr>
       <w:r>
-        <w:t>NFR-004: Todas as palavras-passe devem ser armazenadas utilizando algoritmos de dispersão seguros (BCrypt com salt). Palavras-passe em texto claro são proibidas.</w:t>
+        <w:t>NFR-004: Todas as palavras-passe devem ser armazenadas utilizando algoritmos de dispersão seguros (</w:t>
+      </w:r>
+      <w:proofErr w:type="spellStart"/>
+      <w:r>
+        <w:t>BCrypt</w:t>
+      </w:r>
+      <w:proofErr w:type="spellEnd"/>
+      <w:r>
+        <w:t xml:space="preserve"> com </w:t>
+      </w:r>
+      <w:proofErr w:type="spellStart"/>
+      <w:r>
+        <w:t>salt</w:t>
+      </w:r>
+      <w:proofErr w:type="spellEnd"/>
+      <w:r>
+        <w:t>). Palavras-passe em texto claro são proibidas.</w:t>
       </w:r>
     </w:p>
     <w:p>
@@ -2025,7 +2595,15 @@
         <w:jc w:val="both"/>
       </w:pPr>
       <w:r>
-        <w:t>NFR-006: O sistema deve implementar proteção contra SQL Injection, XSS, CSRF e ataques de força bruta (bloqueio após 5 tentativas falhadas).</w:t>
+        <w:t xml:space="preserve">NFR-006: O sistema deve implementar proteção contra SQL </w:t>
+      </w:r>
+      <w:proofErr w:type="spellStart"/>
+      <w:r>
+        <w:t>Injection</w:t>
+      </w:r>
+      <w:proofErr w:type="spellEnd"/>
+      <w:r>
+        <w:t>, XSS, CSRF e ataques de força bruta (bloqueio após 5 tentativas falhadas).</w:t>
       </w:r>
     </w:p>
     <w:p>
@@ -2060,7 +2638,15 @@
         <w:jc w:val="both"/>
       </w:pPr>
       <w:r>
-        <w:t>NFR-009: Deve existir recuperação automática em caso de falha, com failover em menos de 5 minutos. Backups diários com retenção de 30 dias.</w:t>
+        <w:t xml:space="preserve">NFR-009: Deve existir recuperação automática em caso de falha, com </w:t>
+      </w:r>
+      <w:proofErr w:type="spellStart"/>
+      <w:r>
+        <w:t>failover</w:t>
+      </w:r>
+      <w:proofErr w:type="spellEnd"/>
+      <w:r>
+        <w:t xml:space="preserve"> em menos de 5 minutos. Backups diários com retenção de 30 dias.</w:t>
       </w:r>
     </w:p>
     <w:p>
@@ -2077,16 +2663,48 @@
         <w:jc w:val="both"/>
       </w:pPr>
       <w:r>
-        <w:t>NFR-010: A arquitetura deve suportar adição de novos módulos (SPA, Restaurante, Eventos) sem refatorização do núcleo. Sistema modular seguindo Open-Closed Principle.</w:t>
-      </w:r>
-    </w:p>
-    <w:p>
-      <w:pPr>
-        <w:spacing w:after="120" w:line="276" w:lineRule="auto"/>
-        <w:jc w:val="both"/>
-      </w:pPr>
-      <w:r>
-        <w:t>NFR-011: O sistema deve permitir escalar para múltiplas propriedades (cadeia de hotéis) através de multi-tenancy.</w:t>
+        <w:t xml:space="preserve">NFR-010: A arquitetura deve suportar adição de novos módulos (SPA, Restaurante, Eventos) sem </w:t>
+      </w:r>
+      <w:proofErr w:type="spellStart"/>
+      <w:r>
+        <w:t>refatorização</w:t>
+      </w:r>
+      <w:proofErr w:type="spellEnd"/>
+      <w:r>
+        <w:t xml:space="preserve"> do núcleo. Sistema modular seguindo Open-</w:t>
+      </w:r>
+      <w:proofErr w:type="spellStart"/>
+      <w:r>
+        <w:t>Closed</w:t>
+      </w:r>
+      <w:proofErr w:type="spellEnd"/>
+      <w:r>
+        <w:t xml:space="preserve"> </w:t>
+      </w:r>
+      <w:proofErr w:type="spellStart"/>
+      <w:r>
+        <w:t>Principle</w:t>
+      </w:r>
+      <w:proofErr w:type="spellEnd"/>
+      <w:r>
+        <w:t>.</w:t>
+      </w:r>
+    </w:p>
+    <w:p>
+      <w:pPr>
+        <w:spacing w:after="120" w:line="276" w:lineRule="auto"/>
+        <w:jc w:val="both"/>
+      </w:pPr>
+      <w:r>
+        <w:t xml:space="preserve">NFR-011: O sistema deve permitir escalar para múltiplas propriedades (cadeia de hotéis) através de </w:t>
+      </w:r>
+      <w:proofErr w:type="spellStart"/>
+      <w:r>
+        <w:t>multi-tenancy</w:t>
+      </w:r>
+      <w:proofErr w:type="spellEnd"/>
+      <w:r>
+        <w:t>.</w:t>
       </w:r>
     </w:p>
     <w:p>
@@ -2118,25 +2736,49 @@
         <w:jc w:val="both"/>
       </w:pPr>
       <w:r>
-        <w:t>NFR-012: O código deve manter cobertura de testes unitários superior a 70%, medida através de JaCoCo.</w:t>
-      </w:r>
-    </w:p>
-    <w:p>
-      <w:pPr>
-        <w:spacing w:after="120" w:line="276" w:lineRule="auto"/>
-        <w:jc w:val="both"/>
-      </w:pPr>
-      <w:r>
-        <w:t>NFR-013: O código deve seguir convenções Java (Google Java Style Guide) e princípios SOLID.</w:t>
-      </w:r>
-    </w:p>
-    <w:p>
-      <w:pPr>
-        <w:spacing w:after="120" w:line="276" w:lineRule="auto"/>
-        <w:jc w:val="both"/>
-      </w:pPr>
-      <w:r>
-        <w:t>NFR-014: Documentação técnica (JavaDoc, README, diagramas) deve estar atualizada no repositório.</w:t>
+        <w:t xml:space="preserve">NFR-012: O código deve manter cobertura de testes unitários superior a 70%, medida através de </w:t>
+      </w:r>
+      <w:proofErr w:type="spellStart"/>
+      <w:r>
+        <w:t>JaCoCo</w:t>
+      </w:r>
+      <w:proofErr w:type="spellEnd"/>
+      <w:r>
+        <w:t>.</w:t>
+      </w:r>
+    </w:p>
+    <w:p>
+      <w:pPr>
+        <w:spacing w:after="120" w:line="276" w:lineRule="auto"/>
+        <w:jc w:val="both"/>
+      </w:pPr>
+      <w:r>
+        <w:t xml:space="preserve">NFR-013: O código deve seguir convenções Java (Google Java </w:t>
+      </w:r>
+      <w:proofErr w:type="spellStart"/>
+      <w:r>
+        <w:t>Style</w:t>
+      </w:r>
+      <w:proofErr w:type="spellEnd"/>
+      <w:r>
+        <w:t xml:space="preserve"> Guide) e princípios SOLID.</w:t>
+      </w:r>
+    </w:p>
+    <w:p>
+      <w:pPr>
+        <w:spacing w:after="120" w:line="276" w:lineRule="auto"/>
+        <w:jc w:val="both"/>
+      </w:pPr>
+      <w:r>
+        <w:t>NFR-014: Documentação técnica (</w:t>
+      </w:r>
+      <w:proofErr w:type="spellStart"/>
+      <w:r>
+        <w:t>JavaDoc</w:t>
+      </w:r>
+      <w:proofErr w:type="spellEnd"/>
+      <w:r>
+        <w:t>, README, diagramas) deve estar atualizada no repositório.</w:t>
       </w:r>
     </w:p>
     <w:p>
@@ -2162,7 +2804,23 @@
         <w:jc w:val="both"/>
       </w:pPr>
       <w:r>
-        <w:t>NFR-016: A interface de Housekeeping deve ser mobile-first com botões grandes (mínimo 44x44 pixels).</w:t>
+        <w:t xml:space="preserve">NFR-016: A interface de </w:t>
+      </w:r>
+      <w:proofErr w:type="spellStart"/>
+      <w:r>
+        <w:t>Housekeeping</w:t>
+      </w:r>
+      <w:proofErr w:type="spellEnd"/>
+      <w:r>
+        <w:t xml:space="preserve"> deve ser mobile-</w:t>
+      </w:r>
+      <w:proofErr w:type="spellStart"/>
+      <w:r>
+        <w:t>first</w:t>
+      </w:r>
+      <w:proofErr w:type="spellEnd"/>
+      <w:r>
+        <w:t xml:space="preserve"> com botões grandes (mínimo 44x44 pixels).</w:t>
       </w:r>
     </w:p>
     <w:p>
@@ -2241,6 +2899,7 @@
             <w:pPr>
               <w:jc w:val="center"/>
             </w:pPr>
+            <w:proofErr w:type="spellStart"/>
             <w:r>
               <w:rPr>
                 <w:b/>
@@ -2249,25 +2908,9 @@
                 <w:sz w:val="22"/>
                 <w:szCs w:val="22"/>
               </w:rPr>
-              <w:t>Req ID</w:t>
-            </w:r>
-          </w:p>
-        </w:tc>
-        <w:tc>
-          <w:tcPr>
-            <w:tcW w:w="2200" w:type="dxa"/>
-            <w:tcBorders>
-              <w:top w:val="single" w:sz="1" w:space="0" w:color="CCCCCC"/>
-              <w:left w:val="single" w:sz="1" w:space="0" w:color="CCCCCC"/>
-              <w:bottom w:val="single" w:sz="1" w:space="0" w:color="CCCCCC"/>
-              <w:right w:val="single" w:sz="1" w:space="0" w:color="CCCCCC"/>
-            </w:tcBorders>
-            <w:shd w:val="clear" w:color="auto" w:fill="2E74B5"/>
-          </w:tcPr>
-          <w:p>
-            <w:pPr>
-              <w:jc w:val="center"/>
-            </w:pPr>
+              <w:t>Req</w:t>
+            </w:r>
+            <w:proofErr w:type="spellEnd"/>
             <w:r>
               <w:rPr>
                 <w:b/>
@@ -2276,13 +2919,13 @@
                 <w:sz w:val="22"/>
                 <w:szCs w:val="22"/>
               </w:rPr>
-              <w:t>Descrição</w:t>
-            </w:r>
-          </w:p>
-        </w:tc>
-        <w:tc>
-          <w:tcPr>
-            <w:tcW w:w="1400" w:type="dxa"/>
+              <w:t xml:space="preserve"> ID</w:t>
+            </w:r>
+          </w:p>
+        </w:tc>
+        <w:tc>
+          <w:tcPr>
+            <w:tcW w:w="2200" w:type="dxa"/>
             <w:tcBorders>
               <w:top w:val="single" w:sz="1" w:space="0" w:color="CCCCCC"/>
               <w:left w:val="single" w:sz="1" w:space="0" w:color="CCCCCC"/>
@@ -2303,13 +2946,13 @@
                 <w:sz w:val="22"/>
                 <w:szCs w:val="22"/>
               </w:rPr>
-              <w:t>Stakeholder</w:t>
-            </w:r>
-          </w:p>
-        </w:tc>
-        <w:tc>
-          <w:tcPr>
-            <w:tcW w:w="1100" w:type="dxa"/>
+              <w:t>Descrição</w:t>
+            </w:r>
+          </w:p>
+        </w:tc>
+        <w:tc>
+          <w:tcPr>
+            <w:tcW w:w="1400" w:type="dxa"/>
             <w:tcBorders>
               <w:top w:val="single" w:sz="1" w:space="0" w:color="CCCCCC"/>
               <w:left w:val="single" w:sz="1" w:space="0" w:color="CCCCCC"/>
@@ -2322,6 +2965,7 @@
             <w:pPr>
               <w:jc w:val="center"/>
             </w:pPr>
+            <w:proofErr w:type="spellStart"/>
             <w:r>
               <w:rPr>
                 <w:b/>
@@ -2330,13 +2974,14 @@
                 <w:sz w:val="22"/>
                 <w:szCs w:val="22"/>
               </w:rPr>
-              <w:t>Prioridade</w:t>
-            </w:r>
-          </w:p>
-        </w:tc>
-        <w:tc>
-          <w:tcPr>
-            <w:tcW w:w="1700" w:type="dxa"/>
+              <w:t>Stakeholder</w:t>
+            </w:r>
+            <w:proofErr w:type="spellEnd"/>
+          </w:p>
+        </w:tc>
+        <w:tc>
+          <w:tcPr>
+            <w:tcW w:w="1100" w:type="dxa"/>
             <w:tcBorders>
               <w:top w:val="single" w:sz="1" w:space="0" w:color="CCCCCC"/>
               <w:left w:val="single" w:sz="1" w:space="0" w:color="CCCCCC"/>
@@ -2357,7 +3002,7 @@
                 <w:sz w:val="22"/>
                 <w:szCs w:val="22"/>
               </w:rPr>
-              <w:t>Design Ref</w:t>
+              <w:t>Prioridade</w:t>
             </w:r>
           </w:p>
         </w:tc>
@@ -2384,7 +3029,58 @@
                 <w:sz w:val="22"/>
                 <w:szCs w:val="22"/>
               </w:rPr>
-              <w:t>Test Cases</w:t>
+              <w:t xml:space="preserve">Design </w:t>
+            </w:r>
+            <w:proofErr w:type="spellStart"/>
+            <w:r>
+              <w:rPr>
+                <w:b/>
+                <w:bCs/>
+                <w:color w:val="FFFFFF"/>
+                <w:sz w:val="22"/>
+                <w:szCs w:val="22"/>
+              </w:rPr>
+              <w:t>Ref</w:t>
+            </w:r>
+            <w:proofErr w:type="spellEnd"/>
+          </w:p>
+        </w:tc>
+        <w:tc>
+          <w:tcPr>
+            <w:tcW w:w="1700" w:type="dxa"/>
+            <w:tcBorders>
+              <w:top w:val="single" w:sz="1" w:space="0" w:color="CCCCCC"/>
+              <w:left w:val="single" w:sz="1" w:space="0" w:color="CCCCCC"/>
+              <w:bottom w:val="single" w:sz="1" w:space="0" w:color="CCCCCC"/>
+              <w:right w:val="single" w:sz="1" w:space="0" w:color="CCCCCC"/>
+            </w:tcBorders>
+            <w:shd w:val="clear" w:color="auto" w:fill="2E74B5"/>
+          </w:tcPr>
+          <w:p>
+            <w:pPr>
+              <w:jc w:val="center"/>
+            </w:pPr>
+            <w:proofErr w:type="spellStart"/>
+            <w:r>
+              <w:rPr>
+                <w:b/>
+                <w:bCs/>
+                <w:color w:val="FFFFFF"/>
+                <w:sz w:val="22"/>
+                <w:szCs w:val="22"/>
+              </w:rPr>
+              <w:t>Test</w:t>
+            </w:r>
+            <w:proofErr w:type="spellEnd"/>
+            <w:r>
+              <w:rPr>
+                <w:b/>
+                <w:bCs/>
+                <w:color w:val="FFFFFF"/>
+                <w:sz w:val="22"/>
+                <w:szCs w:val="22"/>
+              </w:rPr>
+              <w:t xml:space="preserve"> Cases</w:t>
             </w:r>
           </w:p>
         </w:tc>
@@ -2446,8 +3142,17 @@
                 <w:sz w:val="20"/>
                 <w:szCs w:val="20"/>
               </w:rPr>
-              <w:t>Receção, Hóspede</w:t>
-            </w:r>
+              <w:t xml:space="preserve">Receção, </w:t>
+            </w:r>
+            <w:proofErr w:type="gramStart"/>
+            <w:r>
+              <w:rPr>
+                <w:sz w:val="20"/>
+                <w:szCs w:val="20"/>
+              </w:rPr>
+              <w:t>Hóspede</w:t>
+            </w:r>
+            <w:proofErr w:type="gramEnd"/>
           </w:p>
         </w:tc>
         <w:tc>
@@ -2481,6 +3186,7 @@
             </w:tcBorders>
           </w:tcPr>
           <w:p>
+            <w:proofErr w:type="spellStart"/>
             <w:r>
               <w:rPr>
                 <w:sz w:val="20"/>
@@ -2488,6 +3194,7 @@
               </w:rPr>
               <w:t>ServicoQuarto</w:t>
             </w:r>
+            <w:proofErr w:type="spellEnd"/>
           </w:p>
         </w:tc>
         <w:tc>
@@ -2571,8 +3278,17 @@
                 <w:sz w:val="20"/>
                 <w:szCs w:val="20"/>
               </w:rPr>
-              <w:t>Receção, Hóspede</w:t>
-            </w:r>
+              <w:t xml:space="preserve">Receção, </w:t>
+            </w:r>
+            <w:proofErr w:type="gramStart"/>
+            <w:r>
+              <w:rPr>
+                <w:sz w:val="20"/>
+                <w:szCs w:val="20"/>
+              </w:rPr>
+              <w:t>Hóspede</w:t>
+            </w:r>
+            <w:proofErr w:type="gramEnd"/>
           </w:p>
         </w:tc>
         <w:tc>
@@ -2608,6 +3324,7 @@
             <w:shd w:val="clear" w:color="auto" w:fill="F2F2F2"/>
           </w:tcPr>
           <w:p>
+            <w:proofErr w:type="spellStart"/>
             <w:r>
               <w:rPr>
                 <w:sz w:val="20"/>
@@ -2615,6 +3332,7 @@
               </w:rPr>
               <w:t>ServicoReserva</w:t>
             </w:r>
+            <w:proofErr w:type="spellEnd"/>
           </w:p>
         </w:tc>
         <w:tc>
@@ -2696,8 +3414,17 @@
                 <w:sz w:val="20"/>
                 <w:szCs w:val="20"/>
               </w:rPr>
-              <w:t>Receção, Hóspede</w:t>
-            </w:r>
+              <w:t xml:space="preserve">Receção, </w:t>
+            </w:r>
+            <w:proofErr w:type="gramStart"/>
+            <w:r>
+              <w:rPr>
+                <w:sz w:val="20"/>
+                <w:szCs w:val="20"/>
+              </w:rPr>
+              <w:t>Hóspede</w:t>
+            </w:r>
+            <w:proofErr w:type="gramEnd"/>
           </w:p>
         </w:tc>
         <w:tc>
@@ -2731,6 +3458,7 @@
             </w:tcBorders>
           </w:tcPr>
           <w:p>
+            <w:proofErr w:type="spellStart"/>
             <w:r>
               <w:rPr>
                 <w:sz w:val="20"/>
@@ -2738,6 +3466,7 @@
               </w:rPr>
               <w:t>ServicoReserva</w:t>
             </w:r>
+            <w:proofErr w:type="spellEnd"/>
           </w:p>
         </w:tc>
         <w:tc>
@@ -2821,8 +3550,17 @@
                 <w:sz w:val="20"/>
                 <w:szCs w:val="20"/>
               </w:rPr>
-              <w:t>Receção, Hóspede</w:t>
-            </w:r>
+              <w:t xml:space="preserve">Receção, </w:t>
+            </w:r>
+            <w:proofErr w:type="gramStart"/>
+            <w:r>
+              <w:rPr>
+                <w:sz w:val="20"/>
+                <w:szCs w:val="20"/>
+              </w:rPr>
+              <w:t>Hóspede</w:t>
+            </w:r>
+            <w:proofErr w:type="gramEnd"/>
           </w:p>
         </w:tc>
         <w:tc>
@@ -2858,6 +3596,7 @@
             <w:shd w:val="clear" w:color="auto" w:fill="F2F2F2"/>
           </w:tcPr>
           <w:p>
+            <w:proofErr w:type="spellStart"/>
             <w:r>
               <w:rPr>
                 <w:sz w:val="20"/>
@@ -2865,6 +3604,7 @@
               </w:rPr>
               <w:t>ServicoCheckInOut</w:t>
             </w:r>
+            <w:proofErr w:type="spellEnd"/>
           </w:p>
         </w:tc>
         <w:tc>
@@ -2981,6 +3721,7 @@
             </w:tcBorders>
           </w:tcPr>
           <w:p>
+            <w:proofErr w:type="spellStart"/>
             <w:r>
               <w:rPr>
                 <w:sz w:val="20"/>
@@ -2988,6 +3729,7 @@
               </w:rPr>
               <w:t>ServicoCheckInOut</w:t>
             </w:r>
+            <w:proofErr w:type="spellEnd"/>
           </w:p>
         </w:tc>
         <w:tc>
@@ -3108,6 +3850,7 @@
             <w:shd w:val="clear" w:color="auto" w:fill="F2F2F2"/>
           </w:tcPr>
           <w:p>
+            <w:proofErr w:type="spellStart"/>
             <w:r>
               <w:rPr>
                 <w:sz w:val="20"/>
@@ -3115,6 +3858,7 @@
               </w:rPr>
               <w:t>ServicoLimpeza</w:t>
             </w:r>
+            <w:proofErr w:type="spellEnd"/>
           </w:p>
         </w:tc>
         <w:tc>
@@ -3231,6 +3975,7 @@
             </w:tcBorders>
           </w:tcPr>
           <w:p>
+            <w:proofErr w:type="spellStart"/>
             <w:r>
               <w:rPr>
                 <w:sz w:val="20"/>
@@ -3238,6 +3983,7 @@
               </w:rPr>
               <w:t>ServicoManutencao</w:t>
             </w:r>
+            <w:proofErr w:type="spellEnd"/>
           </w:p>
         </w:tc>
         <w:tc>
@@ -3358,6 +4104,7 @@
             <w:shd w:val="clear" w:color="auto" w:fill="F2F2F2"/>
           </w:tcPr>
           <w:p>
+            <w:proofErr w:type="spellStart"/>
             <w:r>
               <w:rPr>
                 <w:sz w:val="20"/>
@@ -3365,6 +4112,7 @@
               </w:rPr>
               <w:t>ServicoPrecos</w:t>
             </w:r>
+            <w:proofErr w:type="spellEnd"/>
           </w:p>
         </w:tc>
         <w:tc>
@@ -3481,6 +4229,7 @@
             </w:tcBorders>
           </w:tcPr>
           <w:p>
+            <w:proofErr w:type="spellStart"/>
             <w:r>
               <w:rPr>
                 <w:sz w:val="20"/>
@@ -3488,6 +4237,7 @@
               </w:rPr>
               <w:t>ServicoAuth</w:t>
             </w:r>
+            <w:proofErr w:type="spellEnd"/>
           </w:p>
         </w:tc>
         <w:tc>
@@ -3676,8 +4426,17 @@
                 <w:sz w:val="20"/>
                 <w:szCs w:val="20"/>
               </w:rPr>
-              <w:t>Passwords BCrypt</w:t>
-            </w:r>
+              <w:t xml:space="preserve">Passwords </w:t>
+            </w:r>
+            <w:proofErr w:type="spellStart"/>
+            <w:r>
+              <w:rPr>
+                <w:sz w:val="20"/>
+                <w:szCs w:val="20"/>
+              </w:rPr>
+              <w:t>BCrypt</w:t>
+            </w:r>
+            <w:proofErr w:type="spellEnd"/>
           </w:p>
         </w:tc>
         <w:tc>
@@ -3731,6 +4490,7 @@
             </w:tcBorders>
           </w:tcPr>
           <w:p>
+            <w:proofErr w:type="spellStart"/>
             <w:r>
               <w:rPr>
                 <w:sz w:val="20"/>
@@ -3738,6 +4498,7 @@
               </w:rPr>
               <w:t>ServicoAuth</w:t>
             </w:r>
+            <w:proofErr w:type="spellEnd"/>
           </w:p>
         </w:tc>
         <w:tc>

</xml_diff>